<commit_message>
Apply L7/L8 key and qbank fixes, L8 Q3 wording, trial warm-up; rebuild workbook, tutor guide, question bank, trial
Co-Authored-By: Claude Opus 5.5 <noreply@anthropic.com>
Claude-Session: https://claude.ai/code/session_01NYgB3ju57UwWRpkPPM6X7F
</commit_message>
<xml_diff>
--- a/outputs/designed/Math_Inquirers_Lesson6_Trial_60min.docx
+++ b/outputs/designed/Math_Inquirers_Lesson6_Trial_60min.docx
@@ -812,7 +812,7 @@
                 <w:sz w:val="20"/>
                 <w:szCs w:val="20"/>
               </w:rPr>
-              <w:t xml:space="preserve">Coin shop: quick questions with the coins on their desks</w:t>
+              <w:t xml:space="preserve">Money shop: pay for six items with play coins and notes, fewest pieces</w:t>
             </w:r>
           </w:p>
         </w:tc>
@@ -1681,7 +1681,7 @@
           <w:sz w:val="22"/>
           <w:szCs w:val="22"/>
         </w:rPr>
-        <w:t xml:space="preserve">Warm-up: Coin shop</w:t>
+        <w:t xml:space="preserve">Warm-up: Money shop</w:t>
       </w:r>
     </w:p>
     <w:p>
@@ -1707,7 +1707,7 @@
           <w:sz w:val="21"/>
           <w:szCs w:val="21"/>
         </w:rPr>
-        <w:t xml:space="preserve">Pupils already have the coin sheet on the desk. Hold up a price tag (or write it on the board) for each question. Pairs show the coins, then hold them up.</w:t>
+        <w:t xml:space="preserve">Pupils already have play coins (5¢, 10¢, 20¢, 50¢, $1) and play notes ($2, $5, $10, $50) on the desk. Point to one item on the Money Shop slide at a time. Pairs lay out the money, then you click to show the fewest way.</w:t>
       </w:r>
     </w:p>
     <w:p>
@@ -1735,7 +1735,7 @@
           <w:sz w:val="21"/>
           <w:szCs w:val="21"/>
         </w:rPr>
-        <w:t xml:space="preserve">“Welcome to the coin shop! I will show you a price tag. You and your partner pay for it with your coins. Show me.”</w:t>
+        <w:t xml:space="preserve">“Welcome to the money shop! Look at the price tag. Is it cents or dollars? Pay exactly with your coins and notes. Can you use fewer pieces than your partner?”</w:t>
       </w:r>
     </w:p>
     <w:tbl>
@@ -1864,7 +1864,7 @@
                 <w:sz w:val="20"/>
                 <w:szCs w:val="20"/>
               </w:rPr>
-              <w:t xml:space="preserve">Pay 15¢ using two coins.</w:t>
+              <w:t xml:space="preserve">Eraser 65¢.</w:t>
             </w:r>
           </w:p>
         </w:tc>
@@ -1897,7 +1897,7 @@
                 <w:sz w:val="20"/>
                 <w:szCs w:val="20"/>
               </w:rPr>
-              <w:t xml:space="preserve">5¢ + 10¢</w:t>
+              <w:t xml:space="preserve">50¢ + 10¢ + 5¢ (3 coins)</w:t>
             </w:r>
           </w:p>
         </w:tc>
@@ -1935,7 +1935,7 @@
                 <w:sz w:val="20"/>
                 <w:szCs w:val="20"/>
               </w:rPr>
-              <w:t xml:space="preserve">Pay 25¢ using two coins.</w:t>
+              <w:t xml:space="preserve">Pencil 80¢.</w:t>
             </w:r>
           </w:p>
         </w:tc>
@@ -1968,7 +1968,7 @@
                 <w:sz w:val="20"/>
                 <w:szCs w:val="20"/>
               </w:rPr>
-              <w:t xml:space="preserve">5¢ + 20¢</w:t>
+              <w:t xml:space="preserve">50¢ + 20¢ + 10¢ (3 coins)</w:t>
             </w:r>
           </w:p>
         </w:tc>
@@ -2006,7 +2006,7 @@
                 <w:sz w:val="20"/>
                 <w:szCs w:val="20"/>
               </w:rPr>
-              <w:t xml:space="preserve">Pay 30¢ using two coins.</w:t>
+              <w:t xml:space="preserve">Sticker book $3.</w:t>
             </w:r>
           </w:p>
         </w:tc>
@@ -2039,7 +2039,7 @@
                 <w:sz w:val="20"/>
                 <w:szCs w:val="20"/>
               </w:rPr>
-              <w:t xml:space="preserve">10¢ + 20¢</w:t>
+              <w:t xml:space="preserve">$2 note + $1 coin</w:t>
             </w:r>
           </w:p>
         </w:tc>
@@ -2077,7 +2077,7 @@
                 <w:sz w:val="20"/>
                 <w:szCs w:val="20"/>
               </w:rPr>
-              <w:t xml:space="preserve">Pay 35¢ using three coins.</w:t>
+              <w:t xml:space="preserve">Water bottle $12.</w:t>
             </w:r>
           </w:p>
         </w:tc>
@@ -2110,7 +2110,7 @@
                 <w:sz w:val="20"/>
                 <w:szCs w:val="20"/>
               </w:rPr>
-              <w:t xml:space="preserve">20¢ + 10¢ + 5¢</w:t>
+              <w:t xml:space="preserve">$10 + $2 (2 notes)</w:t>
             </w:r>
           </w:p>
         </w:tc>
@@ -2148,7 +2148,7 @@
                 <w:sz w:val="20"/>
                 <w:szCs w:val="20"/>
               </w:rPr>
-              <w:t xml:space="preserve">Who used the fewest coins for 30¢? How many?</w:t>
+              <w:t xml:space="preserve">Toy car $25.</w:t>
             </w:r>
           </w:p>
         </w:tc>
@@ -2181,7 +2181,78 @@
                 <w:sz w:val="20"/>
                 <w:szCs w:val="20"/>
               </w:rPr>
-              <w:t xml:space="preserve">2 coins. You cannot do it with only one.</w:t>
+              <w:t xml:space="preserve">$10 + $10 + $5 (3 notes)</w:t>
+            </w:r>
+          </w:p>
+        </w:tc>
+      </w:tr>
+      <w:tr>
+        <w:trPr>
+          <w:cantSplit/>
+        </w:trPr>
+        <w:tc>
+          <w:tcPr>
+            <w:tcW w:type="dxa" w:w="4600"/>
+            <w:tcBorders>
+              <w:top w:val="single" w:color="000000" w:sz="8"/>
+              <w:left w:val="single" w:color="000000" w:sz="8"/>
+              <w:bottom w:val="single" w:color="000000" w:sz="8"/>
+              <w:right w:val="single" w:color="000000" w:sz="8"/>
+            </w:tcBorders>
+            <w:tcMar>
+              <w:top w:type="dxa" w:w="70"/>
+              <w:left w:type="dxa" w:w="100"/>
+              <w:bottom w:type="dxa" w:w="70"/>
+              <w:right w:type="dxa" w:w="100"/>
+            </w:tcMar>
+            <w:vAlign w:val="center"/>
+          </w:tcPr>
+          <w:p>
+            <w:pPr>
+              <w:keepLines/>
+              <w:spacing w:after="0" w:before="0" w:line="320" w:lineRule="auto"/>
+              <w:jc w:val="left"/>
+            </w:pPr>
+            <w:r>
+              <w:rPr>
+                <w:rFonts w:ascii="Arial" w:cs="Arial" w:eastAsia="Arial" w:hAnsi="Arial"/>
+                <w:sz w:val="20"/>
+                <w:szCs w:val="20"/>
+              </w:rPr>
+              <w:t xml:space="preserve">Scooter $65.</w:t>
+            </w:r>
+          </w:p>
+        </w:tc>
+        <w:tc>
+          <w:tcPr>
+            <w:tcW w:type="dxa" w:w="5300"/>
+            <w:tcBorders>
+              <w:top w:val="single" w:color="000000" w:sz="8"/>
+              <w:left w:val="single" w:color="000000" w:sz="8"/>
+              <w:bottom w:val="single" w:color="000000" w:sz="8"/>
+              <w:right w:val="single" w:color="000000" w:sz="8"/>
+            </w:tcBorders>
+            <w:tcMar>
+              <w:top w:type="dxa" w:w="70"/>
+              <w:left w:type="dxa" w:w="100"/>
+              <w:bottom w:type="dxa" w:w="70"/>
+              <w:right w:type="dxa" w:w="100"/>
+            </w:tcMar>
+            <w:vAlign w:val="center"/>
+          </w:tcPr>
+          <w:p>
+            <w:pPr>
+              <w:keepLines/>
+              <w:spacing w:after="0" w:before="0" w:line="320" w:lineRule="auto"/>
+              <w:jc w:val="left"/>
+            </w:pPr>
+            <w:r>
+              <w:rPr>
+                <w:rFonts w:ascii="Arial" w:cs="Arial" w:eastAsia="Arial" w:hAnsi="Arial"/>
+                <w:sz w:val="20"/>
+                <w:szCs w:val="20"/>
+              </w:rPr>
+              <w:t xml:space="preserve">$50 + $10 + $5 (3 notes)</w:t>
             </w:r>
           </w:p>
         </w:tc>

</xml_diff>